<commit_message>
add direct feature tests
</commit_message>
<xml_diff>
--- a/docs/deliverables/Milestone_Tracker.docx
+++ b/docs/deliverables/Milestone_Tracker.docx
@@ -118,7 +118,7 @@
         <w:t xml:space="preserve"> </w:t>
       </w:r>
       <w:r>
-        <w:t xml:space="preserve">14 July 2026 (33/33 tests passing in a clean environment; robustness round on held-out seeds: precision 0.95 to 1.00, recall 0.84 to 1.00, all runs above the proposal thresholds)</w:t>
+        <w:t xml:space="preserve">19 August 2026 (37/37 tests passing on Python 3.14.0 with pandas 3.0.1; robustness round on held-out seeds: precision 0.96 to 1.00, recall 0.84 to 1.00, all runs above the proposal thresholds)</w:t>
       </w:r>
     </w:p>
     <w:p>
@@ -2721,6 +2721,240 @@
       <w:sz w:val="20"/>
       <w:szCs w:val="20"/>
     </w:rPr>
+  </w:style>
+  <w:style w:customStyle="1" w:styleId="SourceCode" w:type="paragraph">
+    <w:name w:val="Source Code"/>
+    <w:basedOn w:val="Normal"/>
+    <w:link w:val="VerbatimChar"/>
+    <w:pPr>
+      <w:wordWrap w:val="off"/>
+    </w:pPr>
+  </w:style>
+  <w:style w:customStyle="1" w:styleId="KeywordTok" w:type="character">
+    <w:name w:val="KeywordTok"/>
+    <w:basedOn w:val="VerbatimChar"/>
+    <w:rPr>
+      <w:b/>
+      <w:color w:val="007020"/>
+    </w:rPr>
+  </w:style>
+  <w:style w:customStyle="1" w:styleId="DataTypeTok" w:type="character">
+    <w:name w:val="DataTypeTok"/>
+    <w:basedOn w:val="VerbatimChar"/>
+    <w:rPr>
+      <w:color w:val="902000"/>
+    </w:rPr>
+  </w:style>
+  <w:style w:customStyle="1" w:styleId="DecValTok" w:type="character">
+    <w:name w:val="DecValTok"/>
+    <w:basedOn w:val="VerbatimChar"/>
+    <w:rPr>
+      <w:color w:val="40a070"/>
+    </w:rPr>
+  </w:style>
+  <w:style w:customStyle="1" w:styleId="BaseNTok" w:type="character">
+    <w:name w:val="BaseNTok"/>
+    <w:basedOn w:val="VerbatimChar"/>
+    <w:rPr>
+      <w:color w:val="40a070"/>
+    </w:rPr>
+  </w:style>
+  <w:style w:customStyle="1" w:styleId="FloatTok" w:type="character">
+    <w:name w:val="FloatTok"/>
+    <w:basedOn w:val="VerbatimChar"/>
+    <w:rPr>
+      <w:color w:val="40a070"/>
+    </w:rPr>
+  </w:style>
+  <w:style w:customStyle="1" w:styleId="ConstantTok" w:type="character">
+    <w:name w:val="ConstantTok"/>
+    <w:basedOn w:val="VerbatimChar"/>
+    <w:rPr>
+      <w:color w:val="880000"/>
+    </w:rPr>
+  </w:style>
+  <w:style w:customStyle="1" w:styleId="CharTok" w:type="character">
+    <w:name w:val="CharTok"/>
+    <w:basedOn w:val="VerbatimChar"/>
+    <w:rPr>
+      <w:color w:val="4070a0"/>
+    </w:rPr>
+  </w:style>
+  <w:style w:customStyle="1" w:styleId="SpecialCharTok" w:type="character">
+    <w:name w:val="SpecialCharTok"/>
+    <w:basedOn w:val="VerbatimChar"/>
+    <w:rPr>
+      <w:color w:val="4070a0"/>
+    </w:rPr>
+  </w:style>
+  <w:style w:customStyle="1" w:styleId="StringTok" w:type="character">
+    <w:name w:val="StringTok"/>
+    <w:basedOn w:val="VerbatimChar"/>
+    <w:rPr>
+      <w:color w:val="4070a0"/>
+    </w:rPr>
+  </w:style>
+  <w:style w:customStyle="1" w:styleId="VerbatimStringTok" w:type="character">
+    <w:name w:val="VerbatimStringTok"/>
+    <w:basedOn w:val="VerbatimChar"/>
+    <w:rPr>
+      <w:color w:val="4070a0"/>
+    </w:rPr>
+  </w:style>
+  <w:style w:customStyle="1" w:styleId="SpecialStringTok" w:type="character">
+    <w:name w:val="SpecialStringTok"/>
+    <w:basedOn w:val="VerbatimChar"/>
+    <w:rPr>
+      <w:color w:val="bb6688"/>
+    </w:rPr>
+  </w:style>
+  <w:style w:customStyle="1" w:styleId="ImportTok" w:type="character">
+    <w:name w:val="ImportTok"/>
+    <w:basedOn w:val="VerbatimChar"/>
+    <w:rPr>
+      <w:b/>
+      <w:color w:val="008000"/>
+    </w:rPr>
+  </w:style>
+  <w:style w:customStyle="1" w:styleId="CommentTok" w:type="character">
+    <w:name w:val="CommentTok"/>
+    <w:basedOn w:val="VerbatimChar"/>
+    <w:rPr>
+      <w:i/>
+      <w:color w:val="60a0b0"/>
+    </w:rPr>
+  </w:style>
+  <w:style w:customStyle="1" w:styleId="DocumentationTok" w:type="character">
+    <w:name w:val="DocumentationTok"/>
+    <w:basedOn w:val="VerbatimChar"/>
+    <w:rPr>
+      <w:i/>
+      <w:color w:val="ba2121"/>
+    </w:rPr>
+  </w:style>
+  <w:style w:customStyle="1" w:styleId="AnnotationTok" w:type="character">
+    <w:name w:val="AnnotationTok"/>
+    <w:basedOn w:val="VerbatimChar"/>
+    <w:rPr>
+      <w:b/>
+      <w:i/>
+      <w:color w:val="60a0b0"/>
+    </w:rPr>
+  </w:style>
+  <w:style w:customStyle="1" w:styleId="CommentVarTok" w:type="character">
+    <w:name w:val="CommentVarTok"/>
+    <w:basedOn w:val="VerbatimChar"/>
+    <w:rPr>
+      <w:b/>
+      <w:i/>
+      <w:color w:val="60a0b0"/>
+    </w:rPr>
+  </w:style>
+  <w:style w:customStyle="1" w:styleId="OtherTok" w:type="character">
+    <w:name w:val="OtherTok"/>
+    <w:basedOn w:val="VerbatimChar"/>
+    <w:rPr>
+      <w:color w:val="007020"/>
+    </w:rPr>
+  </w:style>
+  <w:style w:customStyle="1" w:styleId="FunctionTok" w:type="character">
+    <w:name w:val="FunctionTok"/>
+    <w:basedOn w:val="VerbatimChar"/>
+    <w:rPr>
+      <w:color w:val="06287e"/>
+    </w:rPr>
+  </w:style>
+  <w:style w:customStyle="1" w:styleId="VariableTok" w:type="character">
+    <w:name w:val="VariableTok"/>
+    <w:basedOn w:val="VerbatimChar"/>
+    <w:rPr>
+      <w:color w:val="19177c"/>
+    </w:rPr>
+  </w:style>
+  <w:style w:customStyle="1" w:styleId="ControlFlowTok" w:type="character">
+    <w:name w:val="ControlFlowTok"/>
+    <w:basedOn w:val="VerbatimChar"/>
+    <w:rPr>
+      <w:b/>
+      <w:color w:val="007020"/>
+    </w:rPr>
+  </w:style>
+  <w:style w:customStyle="1" w:styleId="OperatorTok" w:type="character">
+    <w:name w:val="OperatorTok"/>
+    <w:basedOn w:val="VerbatimChar"/>
+    <w:rPr>
+      <w:color w:val="666666"/>
+    </w:rPr>
+  </w:style>
+  <w:style w:customStyle="1" w:styleId="BuiltInTok" w:type="character">
+    <w:name w:val="BuiltInTok"/>
+    <w:basedOn w:val="VerbatimChar"/>
+    <w:rPr>
+      <w:color w:val="008000"/>
+    </w:rPr>
+  </w:style>
+  <w:style w:customStyle="1" w:styleId="ExtensionTok" w:type="character">
+    <w:name w:val="ExtensionTok"/>
+    <w:basedOn w:val="VerbatimChar"/>
+    <w:rPr/>
+  </w:style>
+  <w:style w:customStyle="1" w:styleId="PreprocessorTok" w:type="character">
+    <w:name w:val="PreprocessorTok"/>
+    <w:basedOn w:val="VerbatimChar"/>
+    <w:rPr>
+      <w:color w:val="bc7a00"/>
+    </w:rPr>
+  </w:style>
+  <w:style w:customStyle="1" w:styleId="AttributeTok" w:type="character">
+    <w:name w:val="AttributeTok"/>
+    <w:basedOn w:val="VerbatimChar"/>
+    <w:rPr>
+      <w:color w:val="7d9029"/>
+    </w:rPr>
+  </w:style>
+  <w:style w:customStyle="1" w:styleId="RegionMarkerTok" w:type="character">
+    <w:name w:val="RegionMarkerTok"/>
+    <w:basedOn w:val="VerbatimChar"/>
+    <w:rPr/>
+  </w:style>
+  <w:style w:customStyle="1" w:styleId="InformationTok" w:type="character">
+    <w:name w:val="InformationTok"/>
+    <w:basedOn w:val="VerbatimChar"/>
+    <w:rPr>
+      <w:b/>
+      <w:i/>
+      <w:color w:val="60a0b0"/>
+    </w:rPr>
+  </w:style>
+  <w:style w:customStyle="1" w:styleId="WarningTok" w:type="character">
+    <w:name w:val="WarningTok"/>
+    <w:basedOn w:val="VerbatimChar"/>
+    <w:rPr>
+      <w:b/>
+      <w:i/>
+      <w:color w:val="60a0b0"/>
+    </w:rPr>
+  </w:style>
+  <w:style w:customStyle="1" w:styleId="AlertTok" w:type="character">
+    <w:name w:val="AlertTok"/>
+    <w:basedOn w:val="VerbatimChar"/>
+    <w:rPr>
+      <w:b/>
+      <w:color w:val="ff0000"/>
+    </w:rPr>
+  </w:style>
+  <w:style w:customStyle="1" w:styleId="ErrorTok" w:type="character">
+    <w:name w:val="ErrorTok"/>
+    <w:basedOn w:val="VerbatimChar"/>
+    <w:rPr>
+      <w:b/>
+      <w:color w:val="ff0000"/>
+    </w:rPr>
+  </w:style>
+  <w:style w:customStyle="1" w:styleId="NormalTok" w:type="character">
+    <w:name w:val="NormalTok"/>
+    <w:basedOn w:val="VerbatimChar"/>
+    <w:rPr/>
   </w:style>
   <w:style w:type="paragraph" w:customStyle="1" w:styleId="SourceCode">
     <w:name w:val="Source Code"/>

</xml_diff>

<commit_message>
Retarget milestone evidence and archive metadata
</commit_message>
<xml_diff>
--- a/docs/deliverables/Milestone_Tracker.docx
+++ b/docs/deliverables/Milestone_Tracker.docx
@@ -2,7 +2,7 @@
 <file path=word/document.xml><?xml version="1.0" encoding="utf-8"?>
 <w:document xmlns:w="http://schemas.openxmlformats.org/wordprocessingml/2006/main" xmlns:m="http://schemas.openxmlformats.org/officeDocument/2006/math" xmlns:r="http://schemas.openxmlformats.org/officeDocument/2006/relationships" xmlns:o="urn:schemas-microsoft-com:office:office" xmlns:v="urn:schemas-microsoft-com:vml" xmlns:w10="urn:schemas-microsoft-com:office:word" xmlns:a="http://schemas.openxmlformats.org/drawingml/2006/main" xmlns:pic="http://schemas.openxmlformats.org/drawingml/2006/picture" xmlns:wp="http://schemas.openxmlformats.org/drawingml/2006/wordprocessingDrawing">
   <w:body>
-    <w:bookmarkStart w:id="49" w:name="X862d06be5939af52553ee333cb9c28800b27ceb"/>
+    <w:bookmarkStart w:id="42" w:name="X862d06be5939af52553ee333cb9c28800b27ceb"/>
     <w:p>
       <w:pPr>
         <w:pStyle w:val="Heading1"/>
@@ -118,7 +118,19 @@
         <w:t xml:space="preserve"> </w:t>
       </w:r>
       <w:r>
-        <w:t xml:space="preserve">19 August 2026 (37/37 tests passing on Python 3.14.0 with pandas 3.0.1; robustness round on held-out seeds: precision 0.96 to 1.00, recall 0.84 to 1.00, all runs above the proposal thresholds)</w:t>
+        <w:t xml:space="preserve">1 September 2026 (37/37 tests passing on Python 3.14.0 with pandas 3.0.1; robustness round on held-out seeds: precision 0.96 to 1.00, recall 0.84 to 1.00, all runs above the proposal thresholds; milestone tags retargeted to</w:t>
+      </w:r>
+      <w:r>
+        <w:t xml:space="preserve"> </w:t>
+      </w:r>
+      <w:r>
+        <w:rPr>
+          <w:rStyle w:val="VerbatimChar"/>
+        </w:rPr>
+        <w:t xml:space="preserve">main</w:t>
+      </w:r>
+      <w:r>
+        <w:t xml:space="preserve">)</w:t>
       </w:r>
     </w:p>
     <w:p>
@@ -131,7 +143,7 @@
       <w:r>
         <w:t xml:space="preserve"> </w:t>
       </w:r>
-      <w:hyperlink r:id="rId16">
+      <w:hyperlink r:id="rId9">
         <w:r>
           <w:rPr>
             <w:rStyle w:val="Hyperlink"/>
@@ -143,7 +155,7 @@
         <w:t xml:space="preserve">.</w:t>
       </w:r>
     </w:p>
-    <w:bookmarkStart w:id="41" w:name="work-plan-status"/>
+    <w:bookmarkStart w:id="34" w:name="work-plan-status"/>
     <w:p>
       <w:pPr>
         <w:pStyle w:val="Heading2"/>
@@ -304,7 +316,7 @@
             <w:r>
               <w:t xml:space="preserve"> </w:t>
             </w:r>
-            <w:hyperlink r:id="rId17">
+            <w:hyperlink r:id="rId10">
               <w:r>
                 <w:rPr>
                   <w:rStyle w:val="VerbatimChar"/>
@@ -372,7 +384,7 @@
             <w:r>
               <w:t xml:space="preserve"> </w:t>
             </w:r>
-            <w:hyperlink r:id="rId18">
+            <w:hyperlink r:id="rId11">
               <w:r>
                 <w:rPr>
                   <w:rStyle w:val="VerbatimChar"/>
@@ -386,12 +398,12 @@
             <w:r>
               <w:t xml:space="preserve"> </w:t>
             </w:r>
-            <w:hyperlink r:id="rId19">
-              <w:r>
-                <w:rPr>
-                  <w:rStyle w:val="VerbatimChar"/>
-                </w:rPr>
-                <w:t xml:space="preserve">37ae029</w:t>
+            <w:hyperlink r:id="rId12">
+              <w:r>
+                <w:rPr>
+                  <w:rStyle w:val="VerbatimChar"/>
+                </w:rPr>
+                <w:t xml:space="preserve">dd31ba8</w:t>
               </w:r>
             </w:hyperlink>
             <w:r>
@@ -403,12 +415,12 @@
             <w:r>
               <w:t xml:space="preserve"> </w:t>
             </w:r>
-            <w:hyperlink r:id="rId20">
-              <w:r>
-                <w:rPr>
-                  <w:rStyle w:val="VerbatimChar"/>
-                </w:rPr>
-                <w:t xml:space="preserve">cad8b7a</w:t>
+            <w:hyperlink r:id="rId13">
+              <w:r>
+                <w:rPr>
+                  <w:rStyle w:val="VerbatimChar"/>
+                </w:rPr>
+                <w:t xml:space="preserve">7dbc950</w:t>
               </w:r>
             </w:hyperlink>
             <w:r>
@@ -477,7 +489,7 @@
             <w:r>
               <w:t xml:space="preserve"> </w:t>
             </w:r>
-            <w:hyperlink r:id="rId21">
+            <w:hyperlink r:id="rId14">
               <w:r>
                 <w:rPr>
                   <w:rStyle w:val="VerbatimChar"/>
@@ -491,12 +503,12 @@
             <w:r>
               <w:t xml:space="preserve"> </w:t>
             </w:r>
-            <w:hyperlink r:id="rId22">
-              <w:r>
-                <w:rPr>
-                  <w:rStyle w:val="VerbatimChar"/>
-                </w:rPr>
-                <w:t xml:space="preserve">fe89e7f</w:t>
+            <w:hyperlink r:id="rId15">
+              <w:r>
+                <w:rPr>
+                  <w:rStyle w:val="VerbatimChar"/>
+                </w:rPr>
+                <w:t xml:space="preserve">9a0d077</w:t>
               </w:r>
             </w:hyperlink>
             <w:r>
@@ -508,12 +520,12 @@
             <w:r>
               <w:t xml:space="preserve"> </w:t>
             </w:r>
-            <w:hyperlink r:id="rId19">
-              <w:r>
-                <w:rPr>
-                  <w:rStyle w:val="VerbatimChar"/>
-                </w:rPr>
-                <w:t xml:space="preserve">37ae029</w:t>
+            <w:hyperlink r:id="rId12">
+              <w:r>
+                <w:rPr>
+                  <w:rStyle w:val="VerbatimChar"/>
+                </w:rPr>
+                <w:t xml:space="preserve">dd31ba8</w:t>
               </w:r>
             </w:hyperlink>
             <w:r>
@@ -576,7 +588,7 @@
             <w:pPr>
               <w:pStyle w:val="Compact"/>
             </w:pPr>
-            <w:hyperlink r:id="rId23">
+            <w:hyperlink r:id="rId16">
               <w:r>
                 <w:rPr>
                   <w:rStyle w:val="VerbatimChar"/>
@@ -602,12 +614,12 @@
             <w:r>
               <w:t xml:space="preserve"> </w:t>
             </w:r>
-            <w:hyperlink r:id="rId19">
-              <w:r>
-                <w:rPr>
-                  <w:rStyle w:val="VerbatimChar"/>
-                </w:rPr>
-                <w:t xml:space="preserve">37ae029</w:t>
+            <w:hyperlink r:id="rId12">
+              <w:r>
+                <w:rPr>
+                  <w:rStyle w:val="VerbatimChar"/>
+                </w:rPr>
+                <w:t xml:space="preserve">dd31ba8</w:t>
               </w:r>
             </w:hyperlink>
             <w:r>
@@ -619,12 +631,12 @@
             <w:r>
               <w:t xml:space="preserve"> </w:t>
             </w:r>
-            <w:hyperlink r:id="rId24">
-              <w:r>
-                <w:rPr>
-                  <w:rStyle w:val="VerbatimChar"/>
-                </w:rPr>
-                <w:t xml:space="preserve">54ff5c7</w:t>
+            <w:hyperlink r:id="rId17">
+              <w:r>
+                <w:rPr>
+                  <w:rStyle w:val="VerbatimChar"/>
+                </w:rPr>
+                <w:t xml:space="preserve">12532f2</w:t>
               </w:r>
             </w:hyperlink>
             <w:r>
@@ -636,12 +648,12 @@
             <w:r>
               <w:t xml:space="preserve"> </w:t>
             </w:r>
-            <w:hyperlink r:id="rId25">
-              <w:r>
-                <w:rPr>
-                  <w:rStyle w:val="VerbatimChar"/>
-                </w:rPr>
-                <w:t xml:space="preserve">c82fd96</w:t>
+            <w:hyperlink r:id="rId18">
+              <w:r>
+                <w:rPr>
+                  <w:rStyle w:val="VerbatimChar"/>
+                </w:rPr>
+                <w:t xml:space="preserve">711a9ef</w:t>
               </w:r>
             </w:hyperlink>
             <w:r>
@@ -710,7 +722,7 @@
             <w:r>
               <w:t xml:space="preserve"> </w:t>
             </w:r>
-            <w:hyperlink r:id="rId26">
+            <w:hyperlink r:id="rId19">
               <w:r>
                 <w:rPr>
                   <w:rStyle w:val="VerbatimChar"/>
@@ -736,12 +748,12 @@
             <w:r>
               <w:t xml:space="preserve"> </w:t>
             </w:r>
-            <w:hyperlink r:id="rId19">
-              <w:r>
-                <w:rPr>
-                  <w:rStyle w:val="VerbatimChar"/>
-                </w:rPr>
-                <w:t xml:space="preserve">37ae029</w:t>
+            <w:hyperlink r:id="rId12">
+              <w:r>
+                <w:rPr>
+                  <w:rStyle w:val="VerbatimChar"/>
+                </w:rPr>
+                <w:t xml:space="preserve">dd31ba8</w:t>
               </w:r>
             </w:hyperlink>
             <w:r>
@@ -753,12 +765,12 @@
             <w:r>
               <w:t xml:space="preserve"> </w:t>
             </w:r>
-            <w:hyperlink r:id="rId27">
-              <w:r>
-                <w:rPr>
-                  <w:rStyle w:val="VerbatimChar"/>
-                </w:rPr>
-                <w:t xml:space="preserve">96f44db</w:t>
+            <w:hyperlink r:id="rId20">
+              <w:r>
+                <w:rPr>
+                  <w:rStyle w:val="VerbatimChar"/>
+                </w:rPr>
+                <w:t xml:space="preserve">a88df67</w:t>
               </w:r>
             </w:hyperlink>
             <w:r>
@@ -770,12 +782,12 @@
             <w:r>
               <w:t xml:space="preserve"> </w:t>
             </w:r>
-            <w:hyperlink r:id="rId28">
-              <w:r>
-                <w:rPr>
-                  <w:rStyle w:val="VerbatimChar"/>
-                </w:rPr>
-                <w:t xml:space="preserve">36ce869</w:t>
+            <w:hyperlink r:id="rId21">
+              <w:r>
+                <w:rPr>
+                  <w:rStyle w:val="VerbatimChar"/>
+                </w:rPr>
+                <w:t xml:space="preserve">d8f16a2</w:t>
               </w:r>
             </w:hyperlink>
             <w:r>
@@ -838,7 +850,7 @@
             <w:pPr>
               <w:pStyle w:val="Compact"/>
             </w:pPr>
-            <w:hyperlink r:id="rId29">
+            <w:hyperlink r:id="rId22">
               <w:r>
                 <w:rPr>
                   <w:rStyle w:val="VerbatimChar"/>
@@ -864,12 +876,12 @@
             <w:r>
               <w:t xml:space="preserve"> </w:t>
             </w:r>
-            <w:hyperlink r:id="rId30">
-              <w:r>
-                <w:rPr>
-                  <w:rStyle w:val="VerbatimChar"/>
-                </w:rPr>
-                <w:t xml:space="preserve">2f91436</w:t>
+            <w:hyperlink r:id="rId23">
+              <w:r>
+                <w:rPr>
+                  <w:rStyle w:val="VerbatimChar"/>
+                </w:rPr>
+                <w:t xml:space="preserve">d874dea</w:t>
               </w:r>
             </w:hyperlink>
             <w:r>
@@ -878,12 +890,12 @@
             <w:r>
               <w:t xml:space="preserve"> </w:t>
             </w:r>
-            <w:hyperlink r:id="rId27">
-              <w:r>
-                <w:rPr>
-                  <w:rStyle w:val="VerbatimChar"/>
-                </w:rPr>
-                <w:t xml:space="preserve">96f44db</w:t>
+            <w:hyperlink r:id="rId20">
+              <w:r>
+                <w:rPr>
+                  <w:rStyle w:val="VerbatimChar"/>
+                </w:rPr>
+                <w:t xml:space="preserve">a88df67</w:t>
               </w:r>
             </w:hyperlink>
             <w:r>
@@ -895,12 +907,12 @@
             <w:r>
               <w:t xml:space="preserve"> </w:t>
             </w:r>
-            <w:hyperlink r:id="rId31">
-              <w:r>
-                <w:rPr>
-                  <w:rStyle w:val="VerbatimChar"/>
-                </w:rPr>
-                <w:t xml:space="preserve">84cae63</w:t>
+            <w:hyperlink r:id="rId24">
+              <w:r>
+                <w:rPr>
+                  <w:rStyle w:val="VerbatimChar"/>
+                </w:rPr>
+                <w:t xml:space="preserve">6b80831</w:t>
               </w:r>
             </w:hyperlink>
             <w:r>
@@ -912,12 +924,12 @@
             <w:r>
               <w:t xml:space="preserve"> </w:t>
             </w:r>
-            <w:hyperlink r:id="rId32">
-              <w:r>
-                <w:rPr>
-                  <w:rStyle w:val="VerbatimChar"/>
-                </w:rPr>
-                <w:t xml:space="preserve">7bb265d</w:t>
+            <w:hyperlink r:id="rId25">
+              <w:r>
+                <w:rPr>
+                  <w:rStyle w:val="VerbatimChar"/>
+                </w:rPr>
+                <w:t xml:space="preserve">b357fab</w:t>
               </w:r>
             </w:hyperlink>
             <w:r>
@@ -986,7 +998,7 @@
             <w:r>
               <w:t xml:space="preserve"> </w:t>
             </w:r>
-            <w:hyperlink r:id="rId33">
+            <w:hyperlink r:id="rId26">
               <w:r>
                 <w:rPr>
                   <w:rStyle w:val="VerbatimChar"/>
@@ -1096,7 +1108,7 @@
             <w:r>
               <w:t xml:space="preserve"> </w:t>
             </w:r>
-            <w:hyperlink r:id="rId34">
+            <w:hyperlink r:id="rId27">
               <w:r>
                 <w:rPr>
                   <w:rStyle w:val="VerbatimChar"/>
@@ -1125,12 +1137,12 @@
             <w:r>
               <w:t xml:space="preserve"> </w:t>
             </w:r>
-            <w:hyperlink r:id="rId35">
-              <w:r>
-                <w:rPr>
-                  <w:rStyle w:val="VerbatimChar"/>
-                </w:rPr>
-                <w:t xml:space="preserve">0d399cb</w:t>
+            <w:hyperlink r:id="rId28">
+              <w:r>
+                <w:rPr>
+                  <w:rStyle w:val="VerbatimChar"/>
+                </w:rPr>
+                <w:t xml:space="preserve">4844631</w:t>
               </w:r>
             </w:hyperlink>
             <w:r>
@@ -1142,12 +1154,12 @@
             <w:r>
               <w:t xml:space="preserve"> </w:t>
             </w:r>
-            <w:hyperlink r:id="rId36">
-              <w:r>
-                <w:rPr>
-                  <w:rStyle w:val="VerbatimChar"/>
-                </w:rPr>
-                <w:t xml:space="preserve">6716ab7</w:t>
+            <w:hyperlink r:id="rId29">
+              <w:r>
+                <w:rPr>
+                  <w:rStyle w:val="VerbatimChar"/>
+                </w:rPr>
+                <w:t xml:space="preserve">9211e7b</w:t>
               </w:r>
             </w:hyperlink>
             <w:r>
@@ -1159,12 +1171,12 @@
             <w:r>
               <w:t xml:space="preserve"> </w:t>
             </w:r>
-            <w:hyperlink r:id="rId37">
-              <w:r>
-                <w:rPr>
-                  <w:rStyle w:val="VerbatimChar"/>
-                </w:rPr>
-                <w:t xml:space="preserve">42bae73</w:t>
+            <w:hyperlink r:id="rId30">
+              <w:r>
+                <w:rPr>
+                  <w:rStyle w:val="VerbatimChar"/>
+                </w:rPr>
+                <w:t xml:space="preserve">71cc3a4</w:t>
               </w:r>
             </w:hyperlink>
             <w:r>
@@ -1176,12 +1188,12 @@
             <w:r>
               <w:t xml:space="preserve"> </w:t>
             </w:r>
-            <w:hyperlink r:id="rId32">
-              <w:r>
-                <w:rPr>
-                  <w:rStyle w:val="VerbatimChar"/>
-                </w:rPr>
-                <w:t xml:space="preserve">7bb265d</w:t>
+            <w:hyperlink r:id="rId25">
+              <w:r>
+                <w:rPr>
+                  <w:rStyle w:val="VerbatimChar"/>
+                </w:rPr>
+                <w:t xml:space="preserve">b357fab</w:t>
               </w:r>
             </w:hyperlink>
             <w:r>
@@ -1193,7 +1205,7 @@
             <w:r>
               <w:t xml:space="preserve"> </w:t>
             </w:r>
-            <w:hyperlink r:id="rId38">
+            <w:hyperlink r:id="rId31">
               <w:r>
                 <w:rPr>
                   <w:rStyle w:val="VerbatimChar"/>
@@ -1270,7 +1282,7 @@
             <w:pPr>
               <w:pStyle w:val="Compact"/>
             </w:pPr>
-            <w:hyperlink r:id="rId18">
+            <w:hyperlink r:id="rId11">
               <w:r>
                 <w:rPr>
                   <w:rStyle w:val="VerbatimChar"/>
@@ -1284,7 +1296,7 @@
             <w:r>
               <w:t xml:space="preserve"> </w:t>
             </w:r>
-            <w:hyperlink r:id="rId39">
+            <w:hyperlink r:id="rId32">
               <w:r>
                 <w:rPr>
                   <w:rStyle w:val="VerbatimChar"/>
@@ -1310,12 +1322,12 @@
             <w:r>
               <w:t xml:space="preserve"> </w:t>
             </w:r>
-            <w:hyperlink r:id="rId40">
-              <w:r>
-                <w:rPr>
-                  <w:rStyle w:val="VerbatimChar"/>
-                </w:rPr>
-                <w:t xml:space="preserve">5370dac</w:t>
+            <w:hyperlink r:id="rId33">
+              <w:r>
+                <w:rPr>
+                  <w:rStyle w:val="VerbatimChar"/>
+                </w:rPr>
+                <w:t xml:space="preserve">25dfe0d</w:t>
               </w:r>
             </w:hyperlink>
             <w:r>
@@ -1324,12 +1336,12 @@
             <w:r>
               <w:t xml:space="preserve"> </w:t>
             </w:r>
-            <w:hyperlink r:id="rId20">
-              <w:r>
-                <w:rPr>
-                  <w:rStyle w:val="VerbatimChar"/>
-                </w:rPr>
-                <w:t xml:space="preserve">cad8b7a</w:t>
+            <w:hyperlink r:id="rId13">
+              <w:r>
+                <w:rPr>
+                  <w:rStyle w:val="VerbatimChar"/>
+                </w:rPr>
+                <w:t xml:space="preserve">7dbc950</w:t>
               </w:r>
             </w:hyperlink>
           </w:p>
@@ -1376,7 +1388,7 @@
               <w:pStyle w:val="Compact"/>
             </w:pPr>
             <w:r>
-              <w:t xml:space="preserve">Done</w:t>
+              <w:t xml:space="preserve">Ready for submission</w:t>
             </w:r>
           </w:p>
         </w:tc>
@@ -1396,7 +1408,7 @@
               <w:t xml:space="preserve"> </w:t>
             </w:r>
             <w:r>
-              <w:t xml:space="preserve">(Harvard referencing, includes the reconciled robustness results); markdown source in</w:t>
+              <w:t xml:space="preserve">(Harvard referencing, includes the reconciled robustness results and supervisor-requested precision on the fabricated class); markdown source in</w:t>
             </w:r>
             <w:r>
               <w:t xml:space="preserve"> </w:t>
@@ -1462,7 +1474,7 @@
               <w:pStyle w:val="Compact"/>
             </w:pPr>
             <w:r>
-              <w:t xml:space="preserve">Submission package prepared and verified in a clean environment on 14 July 2026: code, datasets, Word deliverables in</w:t>
+              <w:t xml:space="preserve">Submission package prepared and verified in a clean environment, then refreshed on 1 September 2026 after the milestone-tag audit: code, datasets, Word deliverables in</w:t>
             </w:r>
             <w:r>
               <w:t xml:space="preserve"> </w:t>
@@ -1486,14 +1498,14 @@
               <w:t xml:space="preserve">docs/deliverables/Kaoma_Paradata_Presentation.pptx</w:t>
             </w:r>
             <w:r>
-              <w:t xml:space="preserve">, and this tracker</w:t>
+              <w:t xml:space="preserve">, release metadata, and this tracker</w:t>
             </w:r>
           </w:p>
         </w:tc>
       </w:tr>
     </w:tbl>
-    <w:bookmarkEnd w:id="41"/>
-    <w:bookmarkStart w:id="45" w:name="X50e0a039286c04d5bc66ee6c8d2a13090fd80dc"/>
+    <w:bookmarkEnd w:id="34"/>
+    <w:bookmarkStart w:id="38" w:name="X50e0a039286c04d5bc66ee6c8d2a13090fd80dc"/>
     <w:p>
       <w:pPr>
         <w:pStyle w:val="Heading2"/>
@@ -1581,7 +1593,7 @@
             <w:pPr>
               <w:pStyle w:val="Compact"/>
             </w:pPr>
-            <w:hyperlink r:id="rId26">
+            <w:hyperlink r:id="rId19">
               <w:r>
                 <w:rPr>
                   <w:rStyle w:val="VerbatimChar"/>
@@ -1657,7 +1669,7 @@
             <w:pPr>
               <w:pStyle w:val="Compact"/>
             </w:pPr>
-            <w:hyperlink r:id="rId39">
+            <w:hyperlink r:id="rId32">
               <w:r>
                 <w:rPr>
                   <w:rStyle w:val="VerbatimChar"/>
@@ -1709,7 +1721,7 @@
             <w:pPr>
               <w:pStyle w:val="Compact"/>
             </w:pPr>
-            <w:hyperlink r:id="rId34">
+            <w:hyperlink r:id="rId27">
               <w:r>
                 <w:rPr>
                   <w:rStyle w:val="VerbatimChar"/>
@@ -1803,7 +1815,7 @@
             <w:pPr>
               <w:pStyle w:val="Compact"/>
             </w:pPr>
-            <w:hyperlink r:id="rId42">
+            <w:hyperlink r:id="rId35">
               <w:r>
                 <w:rPr>
                   <w:rStyle w:val="VerbatimChar"/>
@@ -1829,7 +1841,7 @@
             <w:r>
               <w:t xml:space="preserve"> </w:t>
             </w:r>
-            <w:hyperlink r:id="rId38">
+            <w:hyperlink r:id="rId31">
               <w:r>
                 <w:rPr>
                   <w:rStyle w:val="VerbatimChar"/>
@@ -1919,7 +1931,7 @@
             <w:pPr>
               <w:pStyle w:val="Compact"/>
             </w:pPr>
-            <w:hyperlink r:id="rId43">
+            <w:hyperlink r:id="rId36">
               <w:r>
                 <w:rPr>
                   <w:rStyle w:val="VerbatimChar"/>
@@ -1983,7 +1995,7 @@
             <w:pPr>
               <w:pStyle w:val="Compact"/>
             </w:pPr>
-            <w:hyperlink r:id="rId44">
+            <w:hyperlink r:id="rId37">
               <w:r>
                 <w:rPr>
                   <w:rStyle w:val="VerbatimChar"/>
@@ -2006,9 +2018,77 @@
           </w:p>
         </w:tc>
       </w:tr>
+      <w:tr>
+        <w:tc>
+          <w:tcPr/>
+          <w:p>
+            <w:pPr>
+              <w:pStyle w:val="Compact"/>
+            </w:pPr>
+            <w:r>
+              <w:t xml:space="preserve">Release archive metadata</w:t>
+            </w:r>
+          </w:p>
+        </w:tc>
+        <w:tc>
+          <w:tcPr/>
+          <w:p>
+            <w:pPr>
+              <w:pStyle w:val="Compact"/>
+            </w:pPr>
+            <w:r>
+              <w:t xml:space="preserve">Done</w:t>
+            </w:r>
+          </w:p>
+        </w:tc>
+        <w:tc>
+          <w:tcPr/>
+          <w:p>
+            <w:pPr>
+              <w:pStyle w:val="Compact"/>
+            </w:pPr>
+            <w:r>
+              <w:rPr>
+                <w:rStyle w:val="VerbatimChar"/>
+              </w:rPr>
+              <w:t xml:space="preserve">LICENSE</w:t>
+            </w:r>
+            <w:r>
+              <w:t xml:space="preserve">,</w:t>
+            </w:r>
+            <w:r>
+              <w:t xml:space="preserve"> </w:t>
+            </w:r>
+            <w:r>
+              <w:rPr>
+                <w:rStyle w:val="VerbatimChar"/>
+              </w:rPr>
+              <w:t xml:space="preserve">CITATION.cff</w:t>
+            </w:r>
+            <w:r>
+              <w:t xml:space="preserve">, and</w:t>
+            </w:r>
+            <w:r>
+              <w:t xml:space="preserve"> </w:t>
+            </w:r>
+            <w:r>
+              <w:rPr>
+                <w:rStyle w:val="VerbatimChar"/>
+              </w:rPr>
+              <w:t xml:space="preserve">requirements-validated.txt</w:t>
+            </w:r>
+            <w:r>
+              <w:t xml:space="preserve"> </w:t>
+            </w:r>
+            <w:r>
+              <w:t xml:space="preserve">capture public reuse terms, citation metadata, and exact package versions for the validated environment</w:t>
+            </w:r>
+          </w:p>
+        </w:tc>
+      </w:tr>
     </w:tbl>
-    <w:bookmarkEnd w:id="45"/>
-    <w:bookmarkStart w:id="48" w:name="progress-review-checkpoints"/>
+    <w:bookmarkEnd w:id="38"/>
+    <w:bookmarkStart w:id="41" w:name="progress-review-checkpoints"/>
     <w:p>
       <w:pPr>
         <w:pStyle w:val="Heading2"/>
@@ -2049,7 +2129,7 @@
       <w:r>
         <w:t xml:space="preserve"> </w:t>
       </w:r>
-      <w:hyperlink r:id="rId46">
+      <w:hyperlink r:id="rId39">
         <w:r>
           <w:rPr>
             <w:rStyle w:val="VerbatimChar"/>
@@ -2100,7 +2180,7 @@
       <w:r>
         <w:t xml:space="preserve"> </w:t>
       </w:r>
-      <w:hyperlink r:id="rId33">
+      <w:hyperlink r:id="rId26">
         <w:r>
           <w:rPr>
             <w:rStyle w:val="VerbatimChar"/>
@@ -2151,7 +2231,7 @@
       <w:r>
         <w:t xml:space="preserve"> </w:t>
       </w:r>
-      <w:hyperlink r:id="rId47">
+      <w:hyperlink r:id="rId40">
         <w:r>
           <w:rPr>
             <w:rStyle w:val="VerbatimChar"/>
@@ -2178,14 +2258,12 @@
         <w:t xml:space="preserve">.</w:t>
       </w:r>
     </w:p>
-    <w:bookmarkEnd w:id="48"/>
-    <w:bookmarkEnd w:id="49"/>
+    <w:bookmarkEnd w:id="41"/>
+    <w:bookmarkEnd w:id="42"/>
     <w:sectPr>
-      <w:footerReference r:id="rId7" w:type="default"/>
-      <w:pgSz w:h="16838" w:orient="portrait" w:w="11906"/>
-      <w:pgMar w:bottom="1440" w:footer="708" w:gutter="0" w:header="708" w:left="1440" w:right="1440" w:top="1440"/>
-      <w:pgNumType/>
-      <w:docGrid w:linePitch="360"/>
+      <w:footnotePr>
+        <w:numRestart w:val="eachSect"/>
+      </w:footnotePr>
     </w:sectPr>
   </w:body>
 </w:document>
@@ -2195,33 +2273,6 @@
 <w:comments xmlns:w="http://schemas.openxmlformats.org/wordprocessingml/2006/main" xmlns:m="http://schemas.openxmlformats.org/officeDocument/2006/math" xmlns:r="http://schemas.openxmlformats.org/officeDocument/2006/relationships" xmlns:o="urn:schemas-microsoft-com:office:office" xmlns:v="urn:schemas-microsoft-com:vml" xmlns:w10="urn:schemas-microsoft-com:office:word" xmlns:a="http://schemas.openxmlformats.org/drawingml/2006/main" xmlns:pic="http://schemas.openxmlformats.org/drawingml/2006/picture" xmlns:wp="http://schemas.openxmlformats.org/drawingml/2006/wordprocessingDrawing"/>
 </file>
 
-<file path=word/footer1.xml><?xml version="1.0" encoding="utf-8"?>
-<w:ftr xmlns:wpc="http://schemas.microsoft.com/office/word/2010/wordprocessingCanvas" xmlns:mc="http://schemas.openxmlformats.org/markup-compatibility/2006" xmlns:o="urn:schemas-microsoft-com:office:office" xmlns:r="http://schemas.openxmlformats.org/officeDocument/2006/relationships" xmlns:m="http://schemas.openxmlformats.org/officeDocument/2006/math" xmlns:v="urn:schemas-microsoft-com:vml" xmlns:wp14="http://schemas.microsoft.com/office/word/2010/wordprocessingDrawing" xmlns:wp="http://schemas.openxmlformats.org/drawingml/2006/wordprocessingDrawing" xmlns:w10="urn:schemas-microsoft-com:office:word" xmlns:w="http://schemas.openxmlformats.org/wordprocessingml/2006/main" xmlns:w14="http://schemas.microsoft.com/office/word/2010/wordml" xmlns:w15="http://schemas.microsoft.com/office/word/2012/wordml" xmlns:wpg="http://schemas.microsoft.com/office/word/2010/wordprocessingGroup" xmlns:wpi="http://schemas.microsoft.com/office/word/2010/wordprocessingInk" xmlns:wne="http://schemas.microsoft.com/office/word/2006/wordml" xmlns:wps="http://schemas.microsoft.com/office/word/2010/wordprocessingShape">
-  <w:p>
-    <w:pPr>
-      <w:jc w:val="center"/>
-    </w:pPr>
-    <w:r>
-      <w:rPr>
-        <w:color w:val="595959"/>
-        <w:sz w:val="18"/>
-        <w:szCs w:val="18"/>
-      </w:rPr>
-      <w:t xml:space="preserve">Page </w:t>
-      <w:fldChar w:fldCharType="begin"/>
-      <w:instrText xml:space="preserve">PAGE</w:instrText>
-      <w:fldChar w:fldCharType="separate"/>
-      <w:fldChar w:fldCharType="end"/>
-      <w:t xml:space="preserve"> of </w:t>
-      <w:fldChar w:fldCharType="begin"/>
-      <w:instrText xml:space="preserve">NUMPAGES</w:instrText>
-      <w:fldChar w:fldCharType="separate"/>
-      <w:fldChar w:fldCharType="end"/>
-    </w:r>
-  </w:p>
-</w:ftr>
-</file>
-
 <file path=word/footnotes.xml><?xml version="1.0" encoding="utf-8"?>
 <w:footnotes xmlns:w="http://schemas.openxmlformats.org/wordprocessingml/2006/main" xmlns:m="http://schemas.openxmlformats.org/officeDocument/2006/math" xmlns:r="http://schemas.openxmlformats.org/officeDocument/2006/relationships" xmlns:o="urn:schemas-microsoft-com:office:office" xmlns:v="urn:schemas-microsoft-com:vml" xmlns:w10="urn:schemas-microsoft-com:office:word" xmlns:a="http://schemas.openxmlformats.org/drawingml/2006/main" xmlns:pic="http://schemas.openxmlformats.org/drawingml/2006/picture" xmlns:wp="http://schemas.openxmlformats.org/drawingml/2006/wordprocessingDrawing">
   <w:footnote w:type="continuationSeparator" w:id="0">
@@ -2242,91 +2293,7 @@
 </file>
 
 <file path=word/numbering.xml><?xml version="1.0" encoding="utf-8"?>
-<w:numbering xmlns:m="http://schemas.openxmlformats.org/officeDocument/2006/math" xmlns:mc="http://schemas.openxmlformats.org/markup-compatibility/2006" xmlns:o="urn:schemas-microsoft-com:office:office" xmlns:r="http://schemas.openxmlformats.org/officeDocument/2006/relationships" xmlns:v="urn:schemas-microsoft-com:vml" xmlns:w="http://schemas.openxmlformats.org/wordprocessingml/2006/main" xmlns:w10="urn:schemas-microsoft-com:office:word" xmlns:w14="http://schemas.microsoft.com/office/word/2010/wordml" xmlns:w15="http://schemas.microsoft.com/office/word/2012/wordml" xmlns:wne="http://schemas.microsoft.com/office/word/2006/wordml" xmlns:wp="http://schemas.openxmlformats.org/drawingml/2006/wordprocessingDrawing" xmlns:wp14="http://schemas.microsoft.com/office/word/2010/wordprocessingDrawing" xmlns:wpc="http://schemas.microsoft.com/office/word/2010/wordprocessingCanvas" xmlns:wpg="http://schemas.microsoft.com/office/word/2010/wordprocessingGroup" xmlns:wpi="http://schemas.microsoft.com/office/word/2010/wordprocessingInk" xmlns:wps="http://schemas.microsoft.com/office/word/2010/wordprocessingShape" mc:Ignorable="w14 w15 wp14">
-  <w:abstractNum w15:restartNumberingAfterBreak="0" w:abstractNumId="1">
-    <w:multiLevelType w:val="hybridMultilevel"/>
-    <w:lvl w15:tentative="1" w:ilvl="0">
-      <w:start w:val="1"/>
-      <w:numFmt w:val="bullet"/>
-      <w:lvlText w:val="●"/>
-      <w:lvlJc w:val="left"/>
-      <w:pPr>
-        <w:ind w:hanging="360" w:left="720"/>
-      </w:pPr>
-    </w:lvl>
-    <w:lvl w15:tentative="1" w:ilvl="1">
-      <w:start w:val="1"/>
-      <w:numFmt w:val="bullet"/>
-      <w:lvlText w:val="○"/>
-      <w:lvlJc w:val="left"/>
-      <w:pPr>
-        <w:ind w:hanging="360" w:left="1440"/>
-      </w:pPr>
-    </w:lvl>
-    <w:lvl w15:tentative="1" w:ilvl="2">
-      <w:start w:val="1"/>
-      <w:numFmt w:val="bullet"/>
-      <w:lvlText w:val="■"/>
-      <w:lvlJc w:val="left"/>
-      <w:pPr>
-        <w:ind w:hanging="360" w:left="2160"/>
-      </w:pPr>
-    </w:lvl>
-    <w:lvl w15:tentative="1" w:ilvl="3">
-      <w:start w:val="1"/>
-      <w:numFmt w:val="bullet"/>
-      <w:lvlText w:val="●"/>
-      <w:lvlJc w:val="left"/>
-      <w:pPr>
-        <w:ind w:hanging="360" w:left="2880"/>
-      </w:pPr>
-    </w:lvl>
-    <w:lvl w15:tentative="1" w:ilvl="4">
-      <w:start w:val="1"/>
-      <w:numFmt w:val="bullet"/>
-      <w:lvlText w:val="○"/>
-      <w:lvlJc w:val="left"/>
-      <w:pPr>
-        <w:ind w:hanging="360" w:left="3600"/>
-      </w:pPr>
-    </w:lvl>
-    <w:lvl w15:tentative="1" w:ilvl="5">
-      <w:start w:val="1"/>
-      <w:numFmt w:val="bullet"/>
-      <w:lvlText w:val="■"/>
-      <w:lvlJc w:val="left"/>
-      <w:pPr>
-        <w:ind w:hanging="360" w:left="4320"/>
-      </w:pPr>
-    </w:lvl>
-    <w:lvl w15:tentative="1" w:ilvl="6">
-      <w:start w:val="1"/>
-      <w:numFmt w:val="bullet"/>
-      <w:lvlText w:val="●"/>
-      <w:lvlJc w:val="left"/>
-      <w:pPr>
-        <w:ind w:hanging="360" w:left="5040"/>
-      </w:pPr>
-    </w:lvl>
-    <w:lvl w15:tentative="1" w:ilvl="7">
-      <w:start w:val="1"/>
-      <w:numFmt w:val="bullet"/>
-      <w:lvlText w:val="●"/>
-      <w:lvlJc w:val="left"/>
-      <w:pPr>
-        <w:ind w:hanging="360" w:left="5760"/>
-      </w:pPr>
-    </w:lvl>
-    <w:lvl w15:tentative="1" w:ilvl="8">
-      <w:start w:val="1"/>
-      <w:numFmt w:val="bullet"/>
-      <w:lvlText w:val="●"/>
-      <w:lvlJc w:val="left"/>
-      <w:pPr>
-        <w:ind w:hanging="360" w:left="6480"/>
-      </w:pPr>
-    </w:lvl>
-  </w:abstractNum>
+<w:numbering xmlns:w="http://schemas.openxmlformats.org/wordprocessingml/2006/main">
   <w:abstractNum w:abstractNumId="990">
     <w:nsid w:val="0000A990"/>
     <w:multiLevelType w:val="multilevel"/>
@@ -2506,12 +2473,6 @@
       </w:rPr>
     </w:lvl>
   </w:abstractNum>
-  <w:num w:numId="1">
-    <w:abstractNumId w:val="1"/>
-    <w:lvlOverride w:ilvl="0">
-      <w:startOverride w:val="1"/>
-    </w:lvlOverride>
-  </w:num>
   <w:num w:numId="1000">
     <w:abstractNumId w:val="990"/>
   </w:num>
@@ -2522,439 +2483,660 @@
 </file>
 
 <file path=word/styles.xml><?xml version="1.0" encoding="utf-8"?>
-<w:styles xmlns:mc="http://schemas.openxmlformats.org/markup-compatibility/2006" xmlns:r="http://schemas.openxmlformats.org/officeDocument/2006/relationships" xmlns:w="http://schemas.openxmlformats.org/wordprocessingml/2006/main" xmlns:w14="http://schemas.microsoft.com/office/word/2010/wordml" xmlns:w15="http://schemas.microsoft.com/office/word/2012/wordml" mc:Ignorable="w14 w15">
+<w:styles xmlns:r="http://schemas.openxmlformats.org/officeDocument/2006/relationships" xmlns:w="http://schemas.openxmlformats.org/wordprocessingml/2006/main">
   <w:docDefaults>
     <w:rPrDefault>
       <w:rPr>
-        <w:rFonts w:ascii="Calibri" w:cs="Calibri" w:eastAsia="Calibri" w:hAnsi="Calibri"/>
-        <w:sz w:val="22"/>
-        <w:szCs w:val="22"/>
+        <w:rFonts w:asciiTheme="minorHAnsi" w:cstheme="minorBidi" w:eastAsiaTheme="minorEastAsia" w:hAnsiTheme="minorHAnsi"/>
+        <w:sz w:val="24"/>
+        <w:szCs w:val="24"/>
+        <w:lang w:bidi="ar-SA" w:eastAsia="zh-CN" w:val="en-US"/>
       </w:rPr>
     </w:rPrDefault>
-    <w:pPrDefault/>
+    <w:pPrDefault>
+      <w:pPr>
+        <w:spacing w:after="200"/>
+      </w:pPr>
+    </w:pPrDefault>
   </w:docDefaults>
+  <w:latentStyles w:count="276" w:defLockedState="0" w:defQFormat="0" w:defSemiHidden="0" w:defUIPriority="0" w:defUnhideWhenUsed="0"/>
+  <w:style w:default="1" w:styleId="Normal" w:type="paragraph">
+    <w:name w:val="Normal"/>
+    <w:qFormat/>
+  </w:style>
+  <w:style w:styleId="BodyText" w:type="paragraph">
+    <w:name w:val="Body Text"/>
+    <w:basedOn w:val="Normal"/>
+    <w:link w:val="BodyTextChar"/>
+    <w:qFormat/>
+    <w:pPr>
+      <w:spacing w:after="180" w:before="180"/>
+    </w:pPr>
+  </w:style>
+  <w:style w:customStyle="1" w:styleId="FirstParagraph" w:type="paragraph">
+    <w:name w:val="First Paragraph"/>
+    <w:basedOn w:val="BodyText"/>
+    <w:next w:val="BodyText"/>
+    <w:qFormat/>
+  </w:style>
+  <w:style w:customStyle="1" w:styleId="Compact" w:type="paragraph">
+    <w:name w:val="Compact"/>
+    <w:basedOn w:val="BodyText"/>
+    <w:qFormat/>
+    <w:pPr>
+      <w:spacing w:after="36" w:before="36"/>
+    </w:pPr>
+  </w:style>
   <w:style w:styleId="Title" w:type="paragraph">
     <w:name w:val="Title"/>
     <w:basedOn w:val="Normal"/>
-    <w:next w:val="Normal"/>
+    <w:next w:val="BodyText"/>
+    <w:link w:val="TitleChar"/>
+    <w:uiPriority w:val="10"/>
     <w:qFormat/>
-    <w:rPr>
+    <w:rsid w:val="00A10FD9"/>
+    <w:pPr>
+      <w:spacing w:after="80" w:line="240" w:lineRule="auto"/>
+      <w:contextualSpacing/>
+      <w:jc w:val="center"/>
+    </w:pPr>
+    <w:rPr>
+      <w:rFonts w:asciiTheme="majorHAnsi" w:cstheme="majorBidi" w:eastAsiaTheme="majorEastAsia" w:hAnsiTheme="majorHAnsi"/>
       <w:sz w:val="56"/>
       <w:szCs w:val="56"/>
     </w:rPr>
   </w:style>
-  <w:style w:styleId="Heading1" w:type="paragraph">
-    <w:name w:val="Heading 1"/>
-    <w:basedOn w:val="Normal"/>
-    <w:next w:val="Normal"/>
+  <w:style w:customStyle="1" w:styleId="TitleChar" w:type="character">
+    <w:name w:val="Title Char"/>
+    <w:basedOn w:val="DefaultParagraphFont"/>
+    <w:link w:val="Title"/>
+    <w:uiPriority w:val="10"/>
+    <w:rsid w:val="00A10FD9"/>
+    <w:rPr>
+      <w:rFonts w:asciiTheme="majorHAnsi" w:cstheme="majorBidi" w:eastAsiaTheme="majorEastAsia" w:hAnsiTheme="majorHAnsi"/>
+      <w:sz w:val="56"/>
+      <w:szCs w:val="56"/>
+    </w:rPr>
+  </w:style>
+  <w:style w:styleId="Subtitle" w:type="paragraph">
+    <w:name w:val="Subtitle"/>
+    <w:basedOn w:val="Title"/>
+    <w:next w:val="BodyText"/>
+    <w:link w:val="SubtitleChar"/>
+    <w:uiPriority w:val="11"/>
+    <w:qFormat/>
+    <w:rsid w:val="00A10FD9"/>
+    <w:pPr>
+      <w:numPr>
+        <w:ilvl w:val="1"/>
+      </w:numPr>
+    </w:pPr>
+    <w:rPr>
+      <w:rFonts w:cstheme="majorBidi" w:eastAsiaTheme="majorEastAsia"/>
+      <w:spacing w:val="15"/>
+      <w:sz w:val="28"/>
+      <w:szCs w:val="28"/>
+    </w:rPr>
+  </w:style>
+  <w:style w:customStyle="1" w:styleId="SubtitleChar" w:type="character">
+    <w:name w:val="Subtitle Char"/>
+    <w:basedOn w:val="DefaultParagraphFont"/>
+    <w:link w:val="Subtitle"/>
+    <w:uiPriority w:val="11"/>
+    <w:rsid w:val="00A10FD9"/>
+    <w:rPr>
+      <w:rFonts w:cstheme="majorBidi" w:eastAsiaTheme="majorEastAsia"/>
+      <w:color w:themeColor="text1" w:themeTint="A6" w:val="595959"/>
+      <w:spacing w:val="15"/>
+      <w:sz w:val="28"/>
+      <w:szCs w:val="28"/>
+    </w:rPr>
+  </w:style>
+  <w:style w:customStyle="1" w:styleId="Author" w:type="paragraph">
+    <w:name w:val="Author"/>
+    <w:basedOn w:val="Title"/>
+    <w:next w:val="BodyText"/>
     <w:qFormat/>
     <w:pPr>
-      <w:spacing w:after="160" w:before="280"/>
+      <w:keepNext/>
+      <w:keepLines/>
     </w:pPr>
     <w:rPr>
-      <w:rFonts w:ascii="Calibri Light" w:cs="Calibri Light" w:eastAsia="Calibri Light" w:hAnsi="Calibri Light"/>
+      <w:sz w:val="24"/>
+      <w:szCs w:val="24"/>
+    </w:rPr>
+  </w:style>
+  <w:style w:styleId="Date" w:type="paragraph">
+    <w:name w:val="Date"/>
+    <w:basedOn w:val="Title"/>
+    <w:next w:val="BodyText"/>
+    <w:qFormat/>
+    <w:pPr>
+      <w:keepNext/>
+      <w:keepLines/>
+    </w:pPr>
+    <w:rPr>
+      <w:sz w:val="24"/>
+      <w:szCs w:val="24"/>
+    </w:rPr>
+  </w:style>
+  <w:style w:customStyle="1" w:styleId="AbstractTitle" w:type="paragraph">
+    <w:name w:val="Abstract Title"/>
+    <w:basedOn w:val="Normal"/>
+    <w:next w:val="Abstract"/>
+    <w:qFormat/>
+    <w:pPr>
+      <w:keepNext/>
+      <w:keepLines/>
+      <w:spacing w:after="0" w:before="300"/>
+      <w:jc w:val="center"/>
+    </w:pPr>
+    <w:rPr>
       <w:b/>
-      <w:bCs/>
-      <w:color w:val="1F4E79"/>
+      <w:sz w:val="20"/>
+      <w:szCs w:val="20"/>
+    </w:rPr>
+  </w:style>
+  <w:style w:customStyle="1" w:styleId="Abstract" w:type="paragraph">
+    <w:name w:val="Abstract"/>
+    <w:basedOn w:val="Normal"/>
+    <w:next w:val="BodyText"/>
+    <w:qFormat/>
+    <w:pPr>
+      <w:keepNext/>
+      <w:keepLines/>
+      <w:spacing w:after="300" w:before="100"/>
+    </w:pPr>
+    <w:rPr>
+      <w:sz w:val="20"/>
+      <w:szCs w:val="20"/>
+    </w:rPr>
+  </w:style>
+  <w:style w:styleId="Bibliography" w:type="paragraph">
+    <w:name w:val="Bibliography"/>
+    <w:basedOn w:val="Normal"/>
+    <w:next w:val="Bibliography"/>
+    <w:qFormat/>
+    <w:pPr/>
+    <w:rPr/>
+  </w:style>
+  <w:style w:styleId="Heading1" w:type="paragraph">
+    <w:name w:val="heading 1"/>
+    <w:basedOn w:val="Normal"/>
+    <w:next w:val="BodyText"/>
+    <w:link w:val="Heading1Char"/>
+    <w:uiPriority w:val="9"/>
+    <w:qFormat/>
+    <w:rsid w:val="00A10FD9"/>
+    <w:pPr>
+      <w:keepNext/>
+      <w:keepLines/>
+      <w:spacing w:after="80" w:before="360"/>
+      <w:outlineLvl w:val="0"/>
+    </w:pPr>
+    <w:rPr>
+      <w:rFonts w:asciiTheme="majorHAnsi" w:cstheme="majorBidi" w:eastAsiaTheme="majorEastAsia" w:hAnsiTheme="majorHAnsi"/>
+      <w:color w:themeColor="accent1" w:themeShade="BF" w:val="0F4761"/>
+      <w:sz w:val="40"/>
+      <w:szCs w:val="40"/>
+    </w:rPr>
+  </w:style>
+  <w:style w:styleId="Heading2" w:type="paragraph">
+    <w:name w:val="heading 2"/>
+    <w:basedOn w:val="Normal"/>
+    <w:next w:val="BodyText"/>
+    <w:link w:val="Heading2Char"/>
+    <w:uiPriority w:val="9"/>
+    <w:semiHidden/>
+    <w:unhideWhenUsed/>
+    <w:qFormat/>
+    <w:rsid w:val="00A10FD9"/>
+    <w:pPr>
+      <w:keepNext/>
+      <w:keepLines/>
+      <w:spacing w:after="80" w:before="160"/>
+      <w:outlineLvl w:val="1"/>
+    </w:pPr>
+    <w:rPr>
+      <w:rFonts w:asciiTheme="majorHAnsi" w:cstheme="majorBidi" w:eastAsiaTheme="majorEastAsia" w:hAnsiTheme="majorHAnsi"/>
+      <w:color w:themeColor="accent1" w:themeShade="BF" w:val="0F4761"/>
       <w:sz w:val="32"/>
       <w:szCs w:val="32"/>
     </w:rPr>
   </w:style>
-  <w:style w:styleId="Heading2" w:type="paragraph">
-    <w:name w:val="Heading 2"/>
+  <w:style w:styleId="Heading3" w:type="paragraph">
+    <w:name w:val="heading 3"/>
     <w:basedOn w:val="Normal"/>
-    <w:next w:val="Normal"/>
+    <w:next w:val="BodyText"/>
+    <w:link w:val="Heading3Char"/>
+    <w:uiPriority w:val="9"/>
+    <w:semiHidden/>
+    <w:unhideWhenUsed/>
+    <w:qFormat/>
+    <w:rsid w:val="00A10FD9"/>
+    <w:pPr>
+      <w:keepNext/>
+      <w:keepLines/>
+      <w:spacing w:after="80" w:before="160"/>
+      <w:outlineLvl w:val="2"/>
+    </w:pPr>
+    <w:rPr>
+      <w:rFonts w:cstheme="majorBidi" w:eastAsiaTheme="majorEastAsia"/>
+      <w:color w:themeColor="accent1" w:themeShade="BF" w:val="0F4761"/>
+      <w:sz w:val="28"/>
+      <w:szCs w:val="28"/>
+    </w:rPr>
+  </w:style>
+  <w:style w:styleId="Heading4" w:type="paragraph">
+    <w:name w:val="heading 4"/>
+    <w:basedOn w:val="Normal"/>
+    <w:next w:val="BodyText"/>
+    <w:link w:val="Heading4Char"/>
+    <w:uiPriority w:val="9"/>
+    <w:semiHidden/>
+    <w:unhideWhenUsed/>
+    <w:qFormat/>
+    <w:rsid w:val="00A10FD9"/>
+    <w:pPr>
+      <w:keepNext/>
+      <w:keepLines/>
+      <w:spacing w:after="40" w:before="80"/>
+      <w:outlineLvl w:val="3"/>
+    </w:pPr>
+    <w:rPr>
+      <w:rFonts w:cstheme="majorBidi" w:eastAsiaTheme="majorEastAsia"/>
+      <w:i/>
+      <w:iCs/>
+      <w:color w:themeColor="accent1" w:themeShade="BF" w:val="0F4761"/>
+    </w:rPr>
+  </w:style>
+  <w:style w:styleId="Heading5" w:type="paragraph">
+    <w:name w:val="heading 5"/>
+    <w:basedOn w:val="Normal"/>
+    <w:next w:val="BodyText"/>
+    <w:link w:val="Heading5Char"/>
+    <w:uiPriority w:val="9"/>
+    <w:semiHidden/>
+    <w:unhideWhenUsed/>
+    <w:qFormat/>
+    <w:rsid w:val="00A10FD9"/>
+    <w:pPr>
+      <w:keepNext/>
+      <w:keepLines/>
+      <w:spacing w:after="40" w:before="80"/>
+      <w:outlineLvl w:val="4"/>
+    </w:pPr>
+    <w:rPr>
+      <w:rFonts w:cstheme="majorBidi" w:eastAsiaTheme="majorEastAsia"/>
+      <w:color w:themeColor="accent1" w:themeShade="BF" w:val="0F4761"/>
+    </w:rPr>
+  </w:style>
+  <w:style w:styleId="Heading6" w:type="paragraph">
+    <w:name w:val="heading 6"/>
+    <w:basedOn w:val="Normal"/>
+    <w:next w:val="BodyText"/>
+    <w:link w:val="Heading6Char"/>
+    <w:uiPriority w:val="9"/>
+    <w:semiHidden/>
+    <w:unhideWhenUsed/>
+    <w:qFormat/>
+    <w:rsid w:val="00A10FD9"/>
+    <w:pPr>
+      <w:keepNext/>
+      <w:keepLines/>
+      <w:spacing w:after="0" w:before="40"/>
+      <w:outlineLvl w:val="5"/>
+    </w:pPr>
+    <w:rPr>
+      <w:rFonts w:cstheme="majorBidi" w:eastAsiaTheme="majorEastAsia"/>
+      <w:i/>
+      <w:iCs/>
+      <w:color w:themeColor="text1" w:themeTint="A6" w:val="595959"/>
+    </w:rPr>
+  </w:style>
+  <w:style w:styleId="Heading7" w:type="paragraph">
+    <w:name w:val="heading 7"/>
+    <w:basedOn w:val="Normal"/>
+    <w:next w:val="BodyText"/>
+    <w:link w:val="Heading7Char"/>
+    <w:uiPriority w:val="9"/>
+    <w:semiHidden/>
+    <w:unhideWhenUsed/>
+    <w:qFormat/>
+    <w:rsid w:val="00A10FD9"/>
+    <w:pPr>
+      <w:keepNext/>
+      <w:keepLines/>
+      <w:spacing w:after="0" w:before="40"/>
+      <w:outlineLvl w:val="6"/>
+    </w:pPr>
+    <w:rPr>
+      <w:rFonts w:cstheme="majorBidi" w:eastAsiaTheme="majorEastAsia"/>
+      <w:color w:themeColor="text1" w:themeTint="A6" w:val="595959"/>
+    </w:rPr>
+  </w:style>
+  <w:style w:styleId="Heading8" w:type="paragraph">
+    <w:name w:val="heading 8"/>
+    <w:basedOn w:val="Normal"/>
+    <w:next w:val="BodyText"/>
+    <w:link w:val="Heading8Char"/>
+    <w:uiPriority w:val="9"/>
+    <w:semiHidden/>
+    <w:unhideWhenUsed/>
+    <w:qFormat/>
+    <w:rsid w:val="00A10FD9"/>
+    <w:pPr>
+      <w:keepNext/>
+      <w:keepLines/>
+      <w:spacing w:after="0"/>
+      <w:outlineLvl w:val="7"/>
+    </w:pPr>
+    <w:rPr>
+      <w:rFonts w:cstheme="majorBidi" w:eastAsiaTheme="majorEastAsia"/>
+      <w:i/>
+      <w:iCs/>
+      <w:color w:themeColor="text1" w:themeTint="D8" w:val="272727"/>
+    </w:rPr>
+  </w:style>
+  <w:style w:styleId="Heading9" w:type="paragraph">
+    <w:name w:val="heading 9"/>
+    <w:basedOn w:val="Normal"/>
+    <w:next w:val="BodyText"/>
+    <w:link w:val="Heading9Char"/>
+    <w:uiPriority w:val="9"/>
+    <w:semiHidden/>
+    <w:unhideWhenUsed/>
+    <w:qFormat/>
+    <w:rsid w:val="00A10FD9"/>
+    <w:pPr>
+      <w:keepNext/>
+      <w:keepLines/>
+      <w:spacing w:after="0"/>
+      <w:outlineLvl w:val="8"/>
+    </w:pPr>
+    <w:rPr>
+      <w:rFonts w:cstheme="majorBidi" w:eastAsiaTheme="majorEastAsia"/>
+      <w:color w:themeColor="text1" w:themeTint="D8" w:val="272727"/>
+    </w:rPr>
+  </w:style>
+  <w:style w:customStyle="1" w:styleId="Heading1Char" w:type="character">
+    <w:name w:val="Heading 1 Char"/>
+    <w:basedOn w:val="DefaultParagraphFont"/>
+    <w:link w:val="Heading1"/>
+    <w:uiPriority w:val="9"/>
+    <w:rsid w:val="00A10FD9"/>
+    <w:rPr>
+      <w:rFonts w:asciiTheme="majorHAnsi" w:cstheme="majorBidi" w:eastAsiaTheme="majorEastAsia" w:hAnsiTheme="majorHAnsi"/>
+      <w:color w:themeColor="accent1" w:themeShade="BF" w:val="0F4761"/>
+      <w:sz w:val="40"/>
+      <w:szCs w:val="40"/>
+    </w:rPr>
+  </w:style>
+  <w:style w:customStyle="1" w:styleId="Heading2Char" w:type="character">
+    <w:name w:val="Heading 2 Char"/>
+    <w:basedOn w:val="DefaultParagraphFont"/>
+    <w:link w:val="Heading2"/>
+    <w:uiPriority w:val="9"/>
+    <w:semiHidden/>
+    <w:rsid w:val="00A10FD9"/>
+    <w:rPr>
+      <w:rFonts w:asciiTheme="majorHAnsi" w:cstheme="majorBidi" w:eastAsiaTheme="majorEastAsia" w:hAnsiTheme="majorHAnsi"/>
+      <w:color w:themeColor="accent1" w:themeShade="BF" w:val="0F4761"/>
+      <w:sz w:val="32"/>
+      <w:szCs w:val="32"/>
+    </w:rPr>
+  </w:style>
+  <w:style w:customStyle="1" w:styleId="Heading3Char" w:type="character">
+    <w:name w:val="Heading 3 Char"/>
+    <w:basedOn w:val="DefaultParagraphFont"/>
+    <w:link w:val="Heading3"/>
+    <w:uiPriority w:val="9"/>
+    <w:semiHidden/>
+    <w:rsid w:val="00A10FD9"/>
+    <w:rPr>
+      <w:rFonts w:cstheme="majorBidi" w:eastAsiaTheme="majorEastAsia"/>
+      <w:color w:themeColor="accent1" w:themeShade="BF" w:val="0F4761"/>
+      <w:sz w:val="28"/>
+      <w:szCs w:val="28"/>
+    </w:rPr>
+  </w:style>
+  <w:style w:customStyle="1" w:styleId="Heading4Char" w:type="character">
+    <w:name w:val="Heading 4 Char"/>
+    <w:basedOn w:val="DefaultParagraphFont"/>
+    <w:link w:val="Heading4"/>
+    <w:uiPriority w:val="9"/>
+    <w:semiHidden/>
+    <w:rsid w:val="00A10FD9"/>
+    <w:rPr>
+      <w:rFonts w:cstheme="majorBidi" w:eastAsiaTheme="majorEastAsia"/>
+      <w:i/>
+      <w:iCs/>
+      <w:color w:themeColor="accent1" w:themeShade="BF" w:val="0F4761"/>
+    </w:rPr>
+  </w:style>
+  <w:style w:customStyle="1" w:styleId="Heading5Char" w:type="character">
+    <w:name w:val="Heading 5 Char"/>
+    <w:basedOn w:val="DefaultParagraphFont"/>
+    <w:link w:val="Heading5"/>
+    <w:uiPriority w:val="9"/>
+    <w:semiHidden/>
+    <w:rsid w:val="00A10FD9"/>
+    <w:rPr>
+      <w:rFonts w:cstheme="majorBidi" w:eastAsiaTheme="majorEastAsia"/>
+      <w:color w:themeColor="accent1" w:themeShade="BF" w:val="0F4761"/>
+    </w:rPr>
+  </w:style>
+  <w:style w:customStyle="1" w:styleId="Heading6Char" w:type="character">
+    <w:name w:val="Heading 6 Char"/>
+    <w:basedOn w:val="DefaultParagraphFont"/>
+    <w:link w:val="Heading6"/>
+    <w:uiPriority w:val="9"/>
+    <w:semiHidden/>
+    <w:rsid w:val="00A10FD9"/>
+    <w:rPr>
+      <w:rFonts w:cstheme="majorBidi" w:eastAsiaTheme="majorEastAsia"/>
+      <w:i/>
+      <w:iCs/>
+      <w:color w:themeColor="text1" w:themeTint="A6" w:val="595959"/>
+    </w:rPr>
+  </w:style>
+  <w:style w:customStyle="1" w:styleId="Heading7Char" w:type="character">
+    <w:name w:val="Heading 7 Char"/>
+    <w:basedOn w:val="DefaultParagraphFont"/>
+    <w:link w:val="Heading7"/>
+    <w:uiPriority w:val="9"/>
+    <w:semiHidden/>
+    <w:rsid w:val="00A10FD9"/>
+    <w:rPr>
+      <w:rFonts w:cstheme="majorBidi" w:eastAsiaTheme="majorEastAsia"/>
+      <w:color w:themeColor="text1" w:themeTint="A6" w:val="595959"/>
+    </w:rPr>
+  </w:style>
+  <w:style w:customStyle="1" w:styleId="Heading8Char" w:type="character">
+    <w:name w:val="Heading 8 Char"/>
+    <w:basedOn w:val="DefaultParagraphFont"/>
+    <w:link w:val="Heading8"/>
+    <w:uiPriority w:val="9"/>
+    <w:semiHidden/>
+    <w:rsid w:val="00A10FD9"/>
+    <w:rPr>
+      <w:rFonts w:cstheme="majorBidi" w:eastAsiaTheme="majorEastAsia"/>
+      <w:i/>
+      <w:iCs/>
+      <w:color w:themeColor="text1" w:themeTint="D8" w:val="272727"/>
+    </w:rPr>
+  </w:style>
+  <w:style w:customStyle="1" w:styleId="Heading9Char" w:type="character">
+    <w:name w:val="Heading 9 Char"/>
+    <w:basedOn w:val="DefaultParagraphFont"/>
+    <w:link w:val="Heading9"/>
+    <w:uiPriority w:val="9"/>
+    <w:semiHidden/>
+    <w:rsid w:val="00A10FD9"/>
+    <w:rPr>
+      <w:rFonts w:cstheme="majorBidi" w:eastAsiaTheme="majorEastAsia"/>
+      <w:color w:themeColor="text1" w:themeTint="D8" w:val="272727"/>
+    </w:rPr>
+  </w:style>
+  <w:style w:styleId="BlockText" w:type="paragraph">
+    <w:name w:val="Block Text"/>
+    <w:basedOn w:val="BodyText"/>
+    <w:next w:val="BodyText"/>
+    <w:uiPriority w:val="9"/>
+    <w:unhideWhenUsed/>
     <w:qFormat/>
     <w:pPr>
-      <w:spacing w:after="120" w:before="240"/>
+      <w:spacing w:after="100" w:before="100"/>
+      <w:ind w:firstLine="0" w:left="480" w:right="480"/>
     </w:pPr>
-    <w:rPr>
-      <w:rFonts w:ascii="Calibri Light" w:cs="Calibri Light" w:eastAsia="Calibri Light" w:hAnsi="Calibri Light"/>
-      <w:b/>
-      <w:bCs/>
-      <w:color w:val="2E74B5"/>
-      <w:sz w:val="26"/>
-      <w:szCs w:val="26"/>
-    </w:rPr>
-  </w:style>
-  <w:style w:styleId="Heading3" w:type="paragraph">
-    <w:name w:val="Heading 3"/>
+  </w:style>
+  <w:style w:styleId="FootnoteText" w:type="paragraph">
+    <w:name w:val="Footnote Text"/>
     <w:basedOn w:val="Normal"/>
-    <w:next w:val="Normal"/>
+    <w:next w:val="FootnoteText"/>
+    <w:uiPriority w:val="9"/>
+    <w:unhideWhenUsed/>
+    <w:qFormat/>
+  </w:style>
+  <w:style w:styleId="FootnoteBlockText" w:type="paragraph">
+    <w:name w:val="Footnote Block Text"/>
+    <w:basedOn w:val="FootnoteText"/>
+    <w:next w:val="FootnoteText"/>
+    <w:uiPriority w:val="9"/>
+    <w:unhideWhenUsed/>
     <w:qFormat/>
     <w:pPr>
-      <w:spacing w:after="100" w:before="200"/>
+      <w:spacing w:after="100" w:before="100"/>
+      <w:ind w:firstLine="0" w:left="480" w:right="480"/>
     </w:pPr>
-    <w:rPr>
-      <w:rFonts w:ascii="Calibri Light" w:cs="Calibri Light" w:eastAsia="Calibri Light" w:hAnsi="Calibri Light"/>
+  </w:style>
+  <w:style w:default="1" w:styleId="DefaultParagraphFont" w:type="character">
+    <w:name w:val="Default Paragraph Font"/>
+    <w:semiHidden/>
+    <w:unhideWhenUsed/>
+  </w:style>
+  <w:style w:default="1" w:styleId="Table" w:type="table">
+    <w:name w:val="Table"/>
+    <w:basedOn w:val="TableNormal"/>
+    <w:semiHidden/>
+    <w:unhideWhenUsed/>
+    <w:qFormat/>
+    <w:tblPr>
+      <w:tblInd w:type="dxa" w:w="0"/>
+      <w:tblCellMar>
+        <w:top w:type="dxa" w:w="0"/>
+        <w:left w:type="dxa" w:w="108"/>
+        <w:bottom w:type="dxa" w:w="0"/>
+        <w:right w:type="dxa" w:w="108"/>
+      </w:tblCellMar>
+    </w:tblPr>
+    <w:tblStylePr w:type="firstRow">
+      <w:tcPr>
+        <w:tcBorders>
+          <w:bottom w:val="single"/>
+        </w:tcBorders>
+        <w:vAlign w:val="bottom"/>
+      </w:tcPr>
+    </w:tblStylePr>
+  </w:style>
+  <w:style w:customStyle="1" w:styleId="DefinitionTerm" w:type="paragraph">
+    <w:name w:val="Definition Term"/>
+    <w:basedOn w:val="Normal"/>
+    <w:next w:val="Definition"/>
+    <w:pPr>
+      <w:keepNext/>
+      <w:keepLines/>
+      <w:spacing w:after="0"/>
+    </w:pPr>
+    <w:rPr>
       <w:b/>
-      <w:bCs/>
-      <w:color w:val="1F3864"/>
-      <w:sz w:val="24"/>
-      <w:szCs w:val="24"/>
-    </w:rPr>
-  </w:style>
-  <w:style w:styleId="Heading4" w:type="paragraph">
-    <w:name w:val="Heading 4"/>
+    </w:rPr>
+  </w:style>
+  <w:style w:customStyle="1" w:styleId="Definition" w:type="paragraph">
+    <w:name w:val="Definition"/>
     <w:basedOn w:val="Normal"/>
-    <w:next w:val="Normal"/>
-    <w:qFormat/>
+  </w:style>
+  <w:style w:styleId="Caption" w:type="paragraph">
+    <w:name w:val="Caption"/>
+    <w:basedOn w:val="Normal"/>
+    <w:link w:val="BodyTextChar"/>
+    <w:pPr>
+      <w:spacing w:after="120" w:before="0"/>
+    </w:pPr>
     <w:rPr>
       <w:i/>
-      <w:iCs/>
-      <w:color w:val="2E74B5"/>
-    </w:rPr>
-  </w:style>
-  <w:style w:styleId="Heading5" w:type="paragraph">
-    <w:name w:val="Heading 5"/>
+    </w:rPr>
+  </w:style>
+  <w:style w:customStyle="1" w:styleId="TableCaption" w:type="paragraph">
+    <w:name w:val="Table Caption"/>
+    <w:basedOn w:val="Caption"/>
+    <w:pPr>
+      <w:keepNext/>
+    </w:pPr>
+  </w:style>
+  <w:style w:customStyle="1" w:styleId="ImageCaption" w:type="paragraph">
+    <w:name w:val="Image Caption"/>
+    <w:basedOn w:val="Caption"/>
+  </w:style>
+  <w:style w:customStyle="1" w:styleId="Figure" w:type="paragraph">
+    <w:name w:val="Figure"/>
     <w:basedOn w:val="Normal"/>
-    <w:next w:val="Normal"/>
-    <w:qFormat/>
-    <w:rPr>
-      <w:color w:val="2E74B5"/>
-    </w:rPr>
-  </w:style>
-  <w:style w:styleId="Heading6" w:type="paragraph">
-    <w:name w:val="Heading 6"/>
-    <w:basedOn w:val="Normal"/>
-    <w:next w:val="Normal"/>
-    <w:qFormat/>
-    <w:rPr>
-      <w:color w:val="1F4D78"/>
-    </w:rPr>
-  </w:style>
-  <w:style w:styleId="Strong" w:type="paragraph">
-    <w:name w:val="Strong"/>
-    <w:basedOn w:val="Normal"/>
-    <w:next w:val="Normal"/>
-    <w:qFormat/>
-    <w:rPr>
-      <w:b/>
-      <w:bCs/>
-    </w:rPr>
-  </w:style>
-  <w:style w:styleId="ListParagraph" w:type="paragraph">
-    <w:name w:val="List Paragraph"/>
-    <w:basedOn w:val="Normal"/>
-    <w:qFormat/>
+  </w:style>
+  <w:style w:customStyle="1" w:styleId="CaptionedFigure" w:type="paragraph">
+    <w:name w:val="Captioned Figure"/>
+    <w:basedOn w:val="Figure"/>
+    <w:pPr>
+      <w:keepNext/>
+    </w:pPr>
+  </w:style>
+  <w:style w:customStyle="1" w:styleId="BodyTextChar" w:type="character">
+    <w:name w:val="Body Text Char"/>
+    <w:basedOn w:val="DefaultParagraphFont"/>
+    <w:link w:val="BodyText"/>
+  </w:style>
+  <w:style w:customStyle="1" w:styleId="VerbatimChar" w:type="character">
+    <w:name w:val="Verbatim Char"/>
+    <w:basedOn w:val="BodyTextChar"/>
+    <w:rPr>
+      <w:rFonts w:ascii="Consolas" w:hAnsi="Consolas"/>
+      <w:sz w:val="22"/>
+    </w:rPr>
+  </w:style>
+  <w:style w:customStyle="1" w:styleId="SectionNumber" w:type="character">
+    <w:name w:val="Section Number"/>
+    <w:basedOn w:val="BodyTextChar"/>
+  </w:style>
+  <w:style w:styleId="FootnoteReference" w:type="character">
+    <w:name w:val="Footnote Reference"/>
+    <w:basedOn w:val="BodyTextChar"/>
+    <w:rPr>
+      <w:vertAlign w:val="superscript"/>
+    </w:rPr>
   </w:style>
   <w:style w:styleId="Hyperlink" w:type="character">
     <w:name w:val="Hyperlink"/>
-    <w:basedOn w:val="DefaultParagraphFont"/>
-    <w:uiPriority w:val="99"/>
+    <w:basedOn w:val="BodyTextChar"/>
+    <w:rPr>
+      <w:color w:themeColor="accent1" w:val="4F81BD"/>
+    </w:rPr>
+  </w:style>
+  <w:style w:styleId="TOCHeading" w:type="paragraph">
+    <w:name w:val="TOC Heading"/>
+    <w:basedOn w:val="Heading1"/>
+    <w:next w:val="BodyText"/>
+    <w:uiPriority w:val="39"/>
     <w:unhideWhenUsed/>
-    <w:rPr>
-      <w:color w:val="0563C1"/>
-      <w:u w:val="single"/>
-    </w:rPr>
-  </w:style>
-  <w:style w:styleId="FootnoteReference" w:type="character">
-    <w:name w:val="footnote reference"/>
-    <w:basedOn w:val="DefaultParagraphFont"/>
-    <w:uiPriority w:val="99"/>
-    <w:semiHidden/>
-    <w:unhideWhenUsed/>
-    <w:rPr>
-      <w:vertAlign w:val="superscript"/>
-    </w:rPr>
-  </w:style>
-  <w:style w:styleId="FootnoteText" w:type="paragraph">
-    <w:name w:val="footnote text"/>
-    <w:basedOn w:val="Normal"/>
-    <w:link w:val="FootnoteTextChar"/>
-    <w:uiPriority w:val="99"/>
-    <w:semiHidden/>
-    <w:unhideWhenUsed/>
+    <w:qFormat/>
     <w:pPr>
-      <w:spacing w:after="0" w:line="240" w:lineRule="auto"/>
+      <w:spacing w:before="240" w:line="259" w:lineRule="auto"/>
+      <w:outlineLvl w:val="9"/>
     </w:pPr>
     <w:rPr>
-      <w:sz w:val="20"/>
-      <w:szCs w:val="20"/>
-    </w:rPr>
-  </w:style>
-  <w:style w:styleId="FootnoteTextChar" w:type="character">
-    <w:name w:val="Footnote Text Char"/>
-    <w:basedOn w:val="DefaultParagraphFont"/>
-    <w:link w:val="FootnoteText"/>
-    <w:uiPriority w:val="99"/>
-    <w:semiHidden/>
-    <w:unhideWhenUsed/>
-    <w:rPr>
-      <w:sz w:val="20"/>
-      <w:szCs w:val="20"/>
-    </w:rPr>
-  </w:style>
-  <w:style w:styleId="EndnoteReference" w:type="character">
-    <w:name w:val="endnote reference"/>
-    <w:basedOn w:val="DefaultParagraphFont"/>
-    <w:uiPriority w:val="99"/>
-    <w:semiHidden/>
-    <w:unhideWhenUsed/>
-    <w:rPr>
-      <w:vertAlign w:val="superscript"/>
-    </w:rPr>
-  </w:style>
-  <w:style w:styleId="EndnoteText" w:type="paragraph">
-    <w:name w:val="endnote text"/>
-    <w:basedOn w:val="Normal"/>
-    <w:link w:val="EndnoteTextChar"/>
-    <w:uiPriority w:val="99"/>
-    <w:semiHidden/>
-    <w:unhideWhenUsed/>
-    <w:pPr>
-      <w:spacing w:after="0" w:line="240" w:lineRule="auto"/>
-    </w:pPr>
-    <w:rPr>
-      <w:sz w:val="20"/>
-      <w:szCs w:val="20"/>
-    </w:rPr>
-  </w:style>
-  <w:style w:styleId="EndnoteTextChar" w:type="character">
-    <w:name w:val="Endnote Text Char"/>
-    <w:basedOn w:val="DefaultParagraphFont"/>
-    <w:link w:val="EndnoteText"/>
-    <w:uiPriority w:val="99"/>
-    <w:semiHidden/>
-    <w:unhideWhenUsed/>
-    <w:rPr>
-      <w:sz w:val="20"/>
-      <w:szCs w:val="20"/>
-    </w:rPr>
-  </w:style>
-  <w:style w:customStyle="1" w:styleId="SourceCode" w:type="paragraph">
-    <w:name w:val="Source Code"/>
-    <w:basedOn w:val="Normal"/>
-    <w:link w:val="VerbatimChar"/>
-    <w:pPr>
-      <w:wordWrap w:val="off"/>
-    </w:pPr>
-  </w:style>
-  <w:style w:customStyle="1" w:styleId="KeywordTok" w:type="character">
-    <w:name w:val="KeywordTok"/>
-    <w:basedOn w:val="VerbatimChar"/>
-    <w:rPr>
-      <w:b/>
-      <w:color w:val="007020"/>
-    </w:rPr>
-  </w:style>
-  <w:style w:customStyle="1" w:styleId="DataTypeTok" w:type="character">
-    <w:name w:val="DataTypeTok"/>
-    <w:basedOn w:val="VerbatimChar"/>
-    <w:rPr>
-      <w:color w:val="902000"/>
-    </w:rPr>
-  </w:style>
-  <w:style w:customStyle="1" w:styleId="DecValTok" w:type="character">
-    <w:name w:val="DecValTok"/>
-    <w:basedOn w:val="VerbatimChar"/>
-    <w:rPr>
-      <w:color w:val="40a070"/>
-    </w:rPr>
-  </w:style>
-  <w:style w:customStyle="1" w:styleId="BaseNTok" w:type="character">
-    <w:name w:val="BaseNTok"/>
-    <w:basedOn w:val="VerbatimChar"/>
-    <w:rPr>
-      <w:color w:val="40a070"/>
-    </w:rPr>
-  </w:style>
-  <w:style w:customStyle="1" w:styleId="FloatTok" w:type="character">
-    <w:name w:val="FloatTok"/>
-    <w:basedOn w:val="VerbatimChar"/>
-    <w:rPr>
-      <w:color w:val="40a070"/>
-    </w:rPr>
-  </w:style>
-  <w:style w:customStyle="1" w:styleId="ConstantTok" w:type="character">
-    <w:name w:val="ConstantTok"/>
-    <w:basedOn w:val="VerbatimChar"/>
-    <w:rPr>
-      <w:color w:val="880000"/>
-    </w:rPr>
-  </w:style>
-  <w:style w:customStyle="1" w:styleId="CharTok" w:type="character">
-    <w:name w:val="CharTok"/>
-    <w:basedOn w:val="VerbatimChar"/>
-    <w:rPr>
-      <w:color w:val="4070a0"/>
-    </w:rPr>
-  </w:style>
-  <w:style w:customStyle="1" w:styleId="SpecialCharTok" w:type="character">
-    <w:name w:val="SpecialCharTok"/>
-    <w:basedOn w:val="VerbatimChar"/>
-    <w:rPr>
-      <w:color w:val="4070a0"/>
-    </w:rPr>
-  </w:style>
-  <w:style w:customStyle="1" w:styleId="StringTok" w:type="character">
-    <w:name w:val="StringTok"/>
-    <w:basedOn w:val="VerbatimChar"/>
-    <w:rPr>
-      <w:color w:val="4070a0"/>
-    </w:rPr>
-  </w:style>
-  <w:style w:customStyle="1" w:styleId="VerbatimStringTok" w:type="character">
-    <w:name w:val="VerbatimStringTok"/>
-    <w:basedOn w:val="VerbatimChar"/>
-    <w:rPr>
-      <w:color w:val="4070a0"/>
-    </w:rPr>
-  </w:style>
-  <w:style w:customStyle="1" w:styleId="SpecialStringTok" w:type="character">
-    <w:name w:val="SpecialStringTok"/>
-    <w:basedOn w:val="VerbatimChar"/>
-    <w:rPr>
-      <w:color w:val="bb6688"/>
-    </w:rPr>
-  </w:style>
-  <w:style w:customStyle="1" w:styleId="ImportTok" w:type="character">
-    <w:name w:val="ImportTok"/>
-    <w:basedOn w:val="VerbatimChar"/>
-    <w:rPr>
-      <w:b/>
-      <w:color w:val="008000"/>
-    </w:rPr>
-  </w:style>
-  <w:style w:customStyle="1" w:styleId="CommentTok" w:type="character">
-    <w:name w:val="CommentTok"/>
-    <w:basedOn w:val="VerbatimChar"/>
-    <w:rPr>
-      <w:i/>
-      <w:color w:val="60a0b0"/>
-    </w:rPr>
-  </w:style>
-  <w:style w:customStyle="1" w:styleId="DocumentationTok" w:type="character">
-    <w:name w:val="DocumentationTok"/>
-    <w:basedOn w:val="VerbatimChar"/>
-    <w:rPr>
-      <w:i/>
-      <w:color w:val="ba2121"/>
-    </w:rPr>
-  </w:style>
-  <w:style w:customStyle="1" w:styleId="AnnotationTok" w:type="character">
-    <w:name w:val="AnnotationTok"/>
-    <w:basedOn w:val="VerbatimChar"/>
-    <w:rPr>
-      <w:b/>
-      <w:i/>
-      <w:color w:val="60a0b0"/>
-    </w:rPr>
-  </w:style>
-  <w:style w:customStyle="1" w:styleId="CommentVarTok" w:type="character">
-    <w:name w:val="CommentVarTok"/>
-    <w:basedOn w:val="VerbatimChar"/>
-    <w:rPr>
-      <w:b/>
-      <w:i/>
-      <w:color w:val="60a0b0"/>
-    </w:rPr>
-  </w:style>
-  <w:style w:customStyle="1" w:styleId="OtherTok" w:type="character">
-    <w:name w:val="OtherTok"/>
-    <w:basedOn w:val="VerbatimChar"/>
-    <w:rPr>
-      <w:color w:val="007020"/>
-    </w:rPr>
-  </w:style>
-  <w:style w:customStyle="1" w:styleId="FunctionTok" w:type="character">
-    <w:name w:val="FunctionTok"/>
-    <w:basedOn w:val="VerbatimChar"/>
-    <w:rPr>
-      <w:color w:val="06287e"/>
-    </w:rPr>
-  </w:style>
-  <w:style w:customStyle="1" w:styleId="VariableTok" w:type="character">
-    <w:name w:val="VariableTok"/>
-    <w:basedOn w:val="VerbatimChar"/>
-    <w:rPr>
-      <w:color w:val="19177c"/>
-    </w:rPr>
-  </w:style>
-  <w:style w:customStyle="1" w:styleId="ControlFlowTok" w:type="character">
-    <w:name w:val="ControlFlowTok"/>
-    <w:basedOn w:val="VerbatimChar"/>
-    <w:rPr>
-      <w:b/>
-      <w:color w:val="007020"/>
-    </w:rPr>
-  </w:style>
-  <w:style w:customStyle="1" w:styleId="OperatorTok" w:type="character">
-    <w:name w:val="OperatorTok"/>
-    <w:basedOn w:val="VerbatimChar"/>
-    <w:rPr>
-      <w:color w:val="666666"/>
-    </w:rPr>
-  </w:style>
-  <w:style w:customStyle="1" w:styleId="BuiltInTok" w:type="character">
-    <w:name w:val="BuiltInTok"/>
-    <w:basedOn w:val="VerbatimChar"/>
-    <w:rPr>
-      <w:color w:val="008000"/>
-    </w:rPr>
-  </w:style>
-  <w:style w:customStyle="1" w:styleId="ExtensionTok" w:type="character">
-    <w:name w:val="ExtensionTok"/>
-    <w:basedOn w:val="VerbatimChar"/>
-    <w:rPr/>
-  </w:style>
-  <w:style w:customStyle="1" w:styleId="PreprocessorTok" w:type="character">
-    <w:name w:val="PreprocessorTok"/>
-    <w:basedOn w:val="VerbatimChar"/>
-    <w:rPr>
-      <w:color w:val="bc7a00"/>
-    </w:rPr>
-  </w:style>
-  <w:style w:customStyle="1" w:styleId="AttributeTok" w:type="character">
-    <w:name w:val="AttributeTok"/>
-    <w:basedOn w:val="VerbatimChar"/>
-    <w:rPr>
-      <w:color w:val="7d9029"/>
-    </w:rPr>
-  </w:style>
-  <w:style w:customStyle="1" w:styleId="RegionMarkerTok" w:type="character">
-    <w:name w:val="RegionMarkerTok"/>
-    <w:basedOn w:val="VerbatimChar"/>
-    <w:rPr/>
-  </w:style>
-  <w:style w:customStyle="1" w:styleId="InformationTok" w:type="character">
-    <w:name w:val="InformationTok"/>
-    <w:basedOn w:val="VerbatimChar"/>
-    <w:rPr>
-      <w:b/>
-      <w:i/>
-      <w:color w:val="60a0b0"/>
-    </w:rPr>
-  </w:style>
-  <w:style w:customStyle="1" w:styleId="WarningTok" w:type="character">
-    <w:name w:val="WarningTok"/>
-    <w:basedOn w:val="VerbatimChar"/>
-    <w:rPr>
-      <w:b/>
-      <w:i/>
-      <w:color w:val="60a0b0"/>
-    </w:rPr>
-  </w:style>
-  <w:style w:customStyle="1" w:styleId="AlertTok" w:type="character">
-    <w:name w:val="AlertTok"/>
-    <w:basedOn w:val="VerbatimChar"/>
-    <w:rPr>
-      <w:b/>
-      <w:color w:val="ff0000"/>
-    </w:rPr>
-  </w:style>
-  <w:style w:customStyle="1" w:styleId="ErrorTok" w:type="character">
-    <w:name w:val="ErrorTok"/>
-    <w:basedOn w:val="VerbatimChar"/>
-    <w:rPr>
-      <w:b/>
-      <w:color w:val="ff0000"/>
-    </w:rPr>
-  </w:style>
-  <w:style w:customStyle="1" w:styleId="NormalTok" w:type="character">
-    <w:name w:val="NormalTok"/>
-    <w:basedOn w:val="VerbatimChar"/>
-    <w:rPr/>
+      <w:rFonts w:asciiTheme="majorHAnsi" w:cstheme="majorBidi" w:eastAsiaTheme="majorEastAsia" w:hAnsiTheme="majorHAnsi"/>
+      <w:b w:val="0"/>
+      <w:bCs w:val="0"/>
+      <w:color w:themeColor="accent1" w:themeShade="BF" w:val="365F91"/>
+    </w:rPr>
   </w:style>
   <w:style w:type="paragraph" w:customStyle="1" w:styleId="SourceCode">
     <w:name w:val="Source Code"/>

</xml_diff>